<commit_message>
docs: integrate FITME Coach Bible into project governance
Co-Authored-By: Claude Sonnet 5 <noreply@anthropic.com>
</commit_message>
<xml_diff>
--- a/docs/product/Product_Bible.md.docx
+++ b/docs/product/Product_Bible.md.docx
@@ -257,6 +257,19 @@
     <w:p>
       <w:r>
         <w:t>The user should eventually say: 'My coach knows me better than any other nutrition app.'</w:t>
+      </w:r>
+    </w:p>
+    <w:p>
+      <w:pPr>
+        <w:pStyle w:val="Heading2"/>
+      </w:pPr>
+      <w:r>
+        <w:t>13. Governance References</w:t>
+      </w:r>
+    </w:p>
+    <w:p>
+      <w:r>
+        <w:t>The canonical source for FITME coaching philosophy and doctrine is docs/governance/FITME_Coach_Bible.md (Chapter 1 approved). Supporting research, ideas and pre-canonical notes are collected in docs/governance/FITME_Coach_Knowledge_Base.md. This Product Bible remains the single source of truth for product scope, roles and delivery process; coaching doctrine detail is governed by the Coach Bible.</w:t>
       </w:r>
     </w:p>
     <w:sectPr>

</xml_diff>